<commit_message>
precios: generadores de tarifarios y revisar_precios_postgres con las escaleras de la caja
Los generadores (docx, html y el de escuelas) traen las tablas de precios en el
código; se actualizan con las mismas escaleras que reglas_precios_v1.md:
suéter oficial, chalecos, faldas, pantalones de vestir, pants 2pz, chamarra
punto, boina y bata, más la sección de precios especiales en caja.

revisar_precios_postgres.py: reglas nuevas (vestir con exclusiones para gris
claro/obscuro y pata de gallo, faldas Gales vs Escolar, chalecos 249-309) y
omite los precios especiales en caja (CBTIS 148, Vicente Guerrero, etc.).
Validado contra la base: 0 inconsistencias.

Tarifarios docx y html regenerados desde Gestor_de_Inventarios/.

Co-Authored-By: Claude Fable 5.1 <noreply@anthropic.com>
</commit_message>
<xml_diff>
--- a/Gestor_de_Inventarios/tarifarios/Tarifario_Chalecos_2026.docx
+++ b/Gestor_de_Inventarios/tarifarios/Tarifario_Chalecos_2026.docx
@@ -406,7 +406,7 @@
                       <w:color w:val="1A1A2E"/>
                       <w:sz w:val="18"/>
                     </w:rPr>
-                    <w:t>36–46</w:t>
+                    <w:t>36, 38, 40</w:t>
                   </w:r>
                 </w:p>
               </w:tc>
@@ -433,6 +433,60 @@
                       <w:sz w:val="18"/>
                     </w:rPr>
                     <w:t>$269</w:t>
+                  </w:r>
+                </w:p>
+              </w:tc>
+            </w:tr>
+            <w:tr>
+              <w:tc>
+                <w:tcPr>
+                  <w:tcW w:type="dxa" w:w="1920"/>
+                  <w:shd w:val="clear" w:color="auto" w:fill="FFFFFF"/>
+                  <w:tcMar>
+                    <w:top w:w="48" w:type="dxa"/>
+                    <w:bottom w:w="48" w:type="dxa"/>
+                    <w:left w:w="100" w:type="dxa"/>
+                    <w:right w:w="100" w:type="dxa"/>
+                  </w:tcMar>
+                </w:tcPr>
+                <w:p>
+                  <w:pPr>
+                    <w:spacing w:before="0" w:after="0"/>
+                    <w:jc w:val="left"/>
+                  </w:pPr>
+                  <w:r>
+                    <w:rPr>
+                      <w:b w:val="0"/>
+                      <w:color w:val="1A1A2E"/>
+                      <w:sz w:val="18"/>
+                    </w:rPr>
+                    <w:t>42, 44, 46</w:t>
+                  </w:r>
+                </w:p>
+              </w:tc>
+              <w:tc>
+                <w:tcPr>
+                  <w:tcW w:type="dxa" w:w="1920"/>
+                  <w:shd w:val="clear" w:color="auto" w:fill="FFFFFF"/>
+                  <w:tcMar>
+                    <w:top w:w="48" w:type="dxa"/>
+                    <w:bottom w:w="48" w:type="dxa"/>
+                    <w:left w:w="100" w:type="dxa"/>
+                    <w:right w:w="100" w:type="dxa"/>
+                  </w:tcMar>
+                </w:tcPr>
+                <w:p>
+                  <w:pPr>
+                    <w:spacing w:before="0" w:after="0"/>
+                    <w:jc w:val="right"/>
+                  </w:pPr>
+                  <w:r>
+                    <w:rPr>
+                      <w:b/>
+                      <w:color w:val="1E3A6E"/>
+                      <w:sz w:val="18"/>
+                    </w:rPr>
+                    <w:t>$289</w:t>
                   </w:r>
                 </w:p>
               </w:tc>
@@ -615,7 +669,7 @@
                       <w:color w:val="1E3A6E"/>
                       <w:sz w:val="18"/>
                     </w:rPr>
-                    <w:t>$240</w:t>
+                    <w:t>$249</w:t>
                   </w:r>
                 </w:p>
               </w:tc>
@@ -643,7 +697,7 @@
                       <w:color w:val="1A1A2E"/>
                       <w:sz w:val="18"/>
                     </w:rPr>
-                    <w:t>10, 12</w:t>
+                    <w:t>10, 12, 14, 16</w:t>
                   </w:r>
                 </w:p>
               </w:tc>
@@ -669,7 +723,7 @@
                       <w:color w:val="1E3A6E"/>
                       <w:sz w:val="18"/>
                     </w:rPr>
-                    <w:t>$245</w:t>
+                    <w:t>$269</w:t>
                   </w:r>
                 </w:p>
               </w:tc>
@@ -697,7 +751,7 @@
                       <w:color w:val="1A1A2E"/>
                       <w:sz w:val="18"/>
                     </w:rPr>
-                    <w:t>14, 16</w:t>
+                    <w:t>32, 34</w:t>
                   </w:r>
                 </w:p>
               </w:tc>
@@ -723,7 +777,7 @@
                       <w:color w:val="1E3A6E"/>
                       <w:sz w:val="18"/>
                     </w:rPr>
-                    <w:t>$250</w:t>
+                    <w:t>$289</w:t>
                   </w:r>
                 </w:p>
               </w:tc>
@@ -751,7 +805,7 @@
                       <w:color w:val="1A1A2E"/>
                       <w:sz w:val="18"/>
                     </w:rPr>
-                    <w:t>32–42, CH–EXG</w:t>
+                    <w:t>36, 38, 40</w:t>
                   </w:r>
                 </w:p>
               </w:tc>
@@ -777,7 +831,61 @@
                       <w:color w:val="1E3A6E"/>
                       <w:sz w:val="18"/>
                     </w:rPr>
-                    <w:t>$270</w:t>
+                    <w:t>$299</w:t>
+                  </w:r>
+                </w:p>
+              </w:tc>
+            </w:tr>
+            <w:tr>
+              <w:tc>
+                <w:tcPr>
+                  <w:tcW w:type="dxa" w:w="1920"/>
+                  <w:shd w:val="clear" w:color="auto" w:fill="FFFFFF"/>
+                  <w:tcMar>
+                    <w:top w:w="48" w:type="dxa"/>
+                    <w:bottom w:w="48" w:type="dxa"/>
+                    <w:left w:w="100" w:type="dxa"/>
+                    <w:right w:w="100" w:type="dxa"/>
+                  </w:tcMar>
+                </w:tcPr>
+                <w:p>
+                  <w:pPr>
+                    <w:spacing w:before="0" w:after="0"/>
+                    <w:jc w:val="left"/>
+                  </w:pPr>
+                  <w:r>
+                    <w:rPr>
+                      <w:b w:val="0"/>
+                      <w:color w:val="1A1A2E"/>
+                      <w:sz w:val="18"/>
+                    </w:rPr>
+                    <w:t>42</w:t>
+                  </w:r>
+                </w:p>
+              </w:tc>
+              <w:tc>
+                <w:tcPr>
+                  <w:tcW w:type="dxa" w:w="1920"/>
+                  <w:shd w:val="clear" w:color="auto" w:fill="FFFFFF"/>
+                  <w:tcMar>
+                    <w:top w:w="48" w:type="dxa"/>
+                    <w:bottom w:w="48" w:type="dxa"/>
+                    <w:left w:w="100" w:type="dxa"/>
+                    <w:right w:w="100" w:type="dxa"/>
+                  </w:tcMar>
+                </w:tcPr>
+                <w:p>
+                  <w:pPr>
+                    <w:spacing w:before="0" w:after="0"/>
+                    <w:jc w:val="right"/>
+                  </w:pPr>
+                  <w:r>
+                    <w:rPr>
+                      <w:b/>
+                      <w:color w:val="1E3A6E"/>
+                      <w:sz w:val="18"/>
+                    </w:rPr>
+                    <w:t>$309</w:t>
                   </w:r>
                 </w:p>
               </w:tc>
@@ -960,7 +1068,7 @@
                       <w:color w:val="1E3A6E"/>
                       <w:sz w:val="18"/>
                     </w:rPr>
-                    <w:t>$245</w:t>
+                    <w:t>$269</w:t>
                   </w:r>
                 </w:p>
               </w:tc>
@@ -1014,7 +1122,7 @@
                       <w:color w:val="1E3A6E"/>
                       <w:sz w:val="18"/>
                     </w:rPr>
-                    <w:t>$265</w:t>
+                    <w:t>$289</w:t>
                   </w:r>
                 </w:p>
               </w:tc>
@@ -1042,7 +1150,7 @@
                       <w:color w:val="1A1A2E"/>
                       <w:sz w:val="18"/>
                     </w:rPr>
-                    <w:t>36–44</w:t>
+                    <w:t>36, 38, 40</w:t>
                   </w:r>
                 </w:p>
               </w:tc>
@@ -1068,7 +1176,61 @@
                       <w:color w:val="1E3A6E"/>
                       <w:sz w:val="18"/>
                     </w:rPr>
-                    <w:t>$275</w:t>
+                    <w:t>$299</w:t>
+                  </w:r>
+                </w:p>
+              </w:tc>
+            </w:tr>
+            <w:tr>
+              <w:tc>
+                <w:tcPr>
+                  <w:tcW w:type="dxa" w:w="1920"/>
+                  <w:shd w:val="clear" w:color="auto" w:fill="EDF4FC"/>
+                  <w:tcMar>
+                    <w:top w:w="48" w:type="dxa"/>
+                    <w:bottom w:w="48" w:type="dxa"/>
+                    <w:left w:w="100" w:type="dxa"/>
+                    <w:right w:w="100" w:type="dxa"/>
+                  </w:tcMar>
+                </w:tcPr>
+                <w:p>
+                  <w:pPr>
+                    <w:spacing w:before="0" w:after="0"/>
+                    <w:jc w:val="left"/>
+                  </w:pPr>
+                  <w:r>
+                    <w:rPr>
+                      <w:b w:val="0"/>
+                      <w:color w:val="1A1A2E"/>
+                      <w:sz w:val="18"/>
+                    </w:rPr>
+                    <w:t>42, 44</w:t>
+                  </w:r>
+                </w:p>
+              </w:tc>
+              <w:tc>
+                <w:tcPr>
+                  <w:tcW w:type="dxa" w:w="1920"/>
+                  <w:shd w:val="clear" w:color="auto" w:fill="EDF4FC"/>
+                  <w:tcMar>
+                    <w:top w:w="48" w:type="dxa"/>
+                    <w:bottom w:w="48" w:type="dxa"/>
+                    <w:left w:w="100" w:type="dxa"/>
+                    <w:right w:w="100" w:type="dxa"/>
+                  </w:tcMar>
+                </w:tcPr>
+                <w:p>
+                  <w:pPr>
+                    <w:spacing w:before="0" w:after="0"/>
+                    <w:jc w:val="right"/>
+                  </w:pPr>
+                  <w:r>
+                    <w:rPr>
+                      <w:b/>
+                      <w:color w:val="1E3A6E"/>
+                      <w:sz w:val="18"/>
+                    </w:rPr>
+                    <w:t>$309</w:t>
                   </w:r>
                 </w:p>
               </w:tc>
@@ -1251,7 +1413,7 @@
                       <w:color w:val="1E3A6E"/>
                       <w:sz w:val="18"/>
                     </w:rPr>
-                    <w:t>$265</w:t>
+                    <w:t>$269</w:t>
                   </w:r>
                 </w:p>
               </w:tc>
@@ -1305,7 +1467,7 @@
                       <w:color w:val="1E3A6E"/>
                       <w:sz w:val="18"/>
                     </w:rPr>
-                    <w:t>$275</w:t>
+                    <w:t>$289</w:t>
                   </w:r>
                 </w:p>
               </w:tc>
@@ -1333,7 +1495,7 @@
                       <w:color w:val="1A1A2E"/>
                       <w:sz w:val="18"/>
                     </w:rPr>
-                    <w:t>36–42</w:t>
+                    <w:t>36, 38, 40</w:t>
                   </w:r>
                 </w:p>
               </w:tc>
@@ -1359,7 +1521,7 @@
                       <w:color w:val="1E3A6E"/>
                       <w:sz w:val="18"/>
                     </w:rPr>
-                    <w:t>$285</w:t>
+                    <w:t>$299</w:t>
                   </w:r>
                 </w:p>
               </w:tc>
@@ -1387,7 +1549,7 @@
                       <w:color w:val="1A1A2E"/>
                       <w:sz w:val="18"/>
                     </w:rPr>
-                    <w:t>44</w:t>
+                    <w:t>42, 44</w:t>
                   </w:r>
                 </w:p>
               </w:tc>
@@ -1413,7 +1575,7 @@
                       <w:color w:val="1E3A6E"/>
                       <w:sz w:val="18"/>
                     </w:rPr>
-                    <w:t>$295</w:t>
+                    <w:t>$309</w:t>
                   </w:r>
                 </w:p>
               </w:tc>
@@ -1502,7 +1664,7 @@
                       <w:color w:val="FFFFFF"/>
                       <w:sz w:val="20"/>
                     </w:rPr>
-                    <w:t>Excepciones — Primaria (1/2)</w:t>
+                    <w:t>Colegio Motolinea</w:t>
                   </w:r>
                 </w:p>
               </w:tc>
@@ -1516,14 +1678,13 @@
               <w:tblLook w:firstColumn="1" w:firstRow="1" w:lastColumn="0" w:lastRow="0" w:noHBand="0" w:noVBand="1" w:val="04A0"/>
             </w:tblPr>
             <w:tblGrid>
-              <w:gridCol w:w="2561"/>
-              <w:gridCol w:w="2561"/>
-              <w:gridCol w:w="2561"/>
+              <w:gridCol w:w="3841"/>
+              <w:gridCol w:w="3841"/>
             </w:tblGrid>
             <w:tr>
               <w:tc>
                 <w:tcPr>
-                  <w:tcW w:type="dxa" w:w="2561"/>
+                  <w:tcW w:type="dxa" w:w="3841"/>
                   <w:shd w:val="clear" w:color="auto" w:fill="FCE8E8"/>
                   <w:tcMar>
                     <w:top w:w="50" w:type="dxa"/>
@@ -1543,39 +1704,13 @@
                       <w:color w:val="B52020"/>
                       <w:sz w:val="17"/>
                     </w:rPr>
-                    <w:t>Escuela</w:t>
-                  </w:r>
-                </w:p>
-              </w:tc>
-              <w:tc>
-                <w:tcPr>
-                  <w:tcW w:type="dxa" w:w="2561"/>
-                  <w:shd w:val="clear" w:color="auto" w:fill="FCE8E8"/>
-                  <w:tcMar>
-                    <w:top w:w="50" w:type="dxa"/>
-                    <w:bottom w:w="50" w:type="dxa"/>
-                    <w:left w:w="100" w:type="dxa"/>
-                    <w:right w:w="100" w:type="dxa"/>
-                  </w:tcMar>
-                </w:tcPr>
-                <w:p>
-                  <w:pPr>
-                    <w:spacing w:before="0" w:after="0"/>
-                    <w:jc w:val="right"/>
-                  </w:pPr>
-                  <w:r>
-                    <w:rPr>
-                      <w:b/>
-                      <w:color w:val="B52020"/>
-                      <w:sz w:val="17"/>
-                    </w:rPr>
                     <w:t>Tallas</w:t>
                   </w:r>
                 </w:p>
               </w:tc>
               <w:tc>
                 <w:tcPr>
-                  <w:tcW w:type="dxa" w:w="2561"/>
+                  <w:tcW w:type="dxa" w:w="3841"/>
                   <w:shd w:val="clear" w:color="auto" w:fill="FCE8E8"/>
                   <w:tcMar>
                     <w:top w:w="50" w:type="dxa"/>
@@ -1603,7 +1738,7 @@
             <w:tr>
               <w:tc>
                 <w:tcPr>
-                  <w:tcW w:type="dxa" w:w="2561"/>
+                  <w:tcW w:type="dxa" w:w="3841"/>
                   <w:shd w:val="clear" w:color="auto" w:fill="FFFFFF"/>
                   <w:tcMar>
                     <w:top w:w="48" w:type="dxa"/>
@@ -1623,13 +1758,13 @@
                       <w:color w:val="1A1A2E"/>
                       <w:sz w:val="18"/>
                     </w:rPr>
-                    <w:t>Huizache</w:t>
+                    <w:t>4, 6, 8</w:t>
                   </w:r>
                 </w:p>
               </w:tc>
               <w:tc>
                 <w:tcPr>
-                  <w:tcW w:type="dxa" w:w="2561"/>
+                  <w:tcW w:type="dxa" w:w="3841"/>
                   <w:shd w:val="clear" w:color="auto" w:fill="FFFFFF"/>
                   <w:tcMar>
                     <w:top w:w="48" w:type="dxa"/>
@@ -1649,13 +1784,95 @@
                       <w:color w:val="1E3A6E"/>
                       <w:sz w:val="18"/>
                     </w:rPr>
-                    <w:t>6, 8</w:t>
+                    <w:t>$249</w:t>
+                  </w:r>
+                </w:p>
+              </w:tc>
+            </w:tr>
+            <w:tr>
+              <w:tc>
+                <w:tcPr>
+                  <w:tcW w:type="dxa" w:w="3841"/>
+                  <w:shd w:val="clear" w:color="auto" w:fill="FDF0F0"/>
+                  <w:tcMar>
+                    <w:top w:w="48" w:type="dxa"/>
+                    <w:bottom w:w="48" w:type="dxa"/>
+                    <w:left w:w="100" w:type="dxa"/>
+                    <w:right w:w="100" w:type="dxa"/>
+                  </w:tcMar>
+                </w:tcPr>
+                <w:p>
+                  <w:pPr>
+                    <w:spacing w:before="0" w:after="0"/>
+                    <w:jc w:val="left"/>
+                  </w:pPr>
+                  <w:r>
+                    <w:rPr>
+                      <w:b w:val="0"/>
+                      <w:color w:val="1A1A2E"/>
+                      <w:sz w:val="18"/>
+                    </w:rPr>
+                    <w:t>10, 12, 14, 16</w:t>
                   </w:r>
                 </w:p>
               </w:tc>
               <w:tc>
                 <w:tcPr>
-                  <w:tcW w:type="dxa" w:w="2561"/>
+                  <w:tcW w:type="dxa" w:w="3841"/>
+                  <w:shd w:val="clear" w:color="auto" w:fill="FDF0F0"/>
+                  <w:tcMar>
+                    <w:top w:w="48" w:type="dxa"/>
+                    <w:bottom w:w="48" w:type="dxa"/>
+                    <w:left w:w="100" w:type="dxa"/>
+                    <w:right w:w="100" w:type="dxa"/>
+                  </w:tcMar>
+                </w:tcPr>
+                <w:p>
+                  <w:pPr>
+                    <w:spacing w:before="0" w:after="0"/>
+                    <w:jc w:val="right"/>
+                  </w:pPr>
+                  <w:r>
+                    <w:rPr>
+                      <w:b/>
+                      <w:color w:val="1E3A6E"/>
+                      <w:sz w:val="18"/>
+                    </w:rPr>
+                    <w:t>$269</w:t>
+                  </w:r>
+                </w:p>
+              </w:tc>
+            </w:tr>
+            <w:tr>
+              <w:tc>
+                <w:tcPr>
+                  <w:tcW w:type="dxa" w:w="3841"/>
+                  <w:shd w:val="clear" w:color="auto" w:fill="FFFFFF"/>
+                  <w:tcMar>
+                    <w:top w:w="48" w:type="dxa"/>
+                    <w:bottom w:w="48" w:type="dxa"/>
+                    <w:left w:w="100" w:type="dxa"/>
+                    <w:right w:w="100" w:type="dxa"/>
+                  </w:tcMar>
+                </w:tcPr>
+                <w:p>
+                  <w:pPr>
+                    <w:spacing w:before="0" w:after="0"/>
+                    <w:jc w:val="left"/>
+                  </w:pPr>
+                  <w:r>
+                    <w:rPr>
+                      <w:b w:val="0"/>
+                      <w:color w:val="1A1A2E"/>
+                      <w:sz w:val="18"/>
+                    </w:rPr>
+                    <w:t>CH, MD</w:t>
+                  </w:r>
+                </w:p>
+              </w:tc>
+              <w:tc>
+                <w:tcPr>
+                  <w:tcW w:type="dxa" w:w="3841"/>
                   <w:shd w:val="clear" w:color="auto" w:fill="FFFFFF"/>
                   <w:tcMar>
                     <w:top w:w="48" w:type="dxa"/>
@@ -1675,7 +1892,7 @@
                       <w:color w:val="1E3A6E"/>
                       <w:sz w:val="18"/>
                     </w:rPr>
-                    <w:t>$240</w:t>
+                    <w:t>$299</w:t>
                   </w:r>
                 </w:p>
               </w:tc>
@@ -1683,7 +1900,7 @@
             <w:tr>
               <w:tc>
                 <w:tcPr>
-                  <w:tcW w:type="dxa" w:w="2561"/>
+                  <w:tcW w:type="dxa" w:w="3841"/>
                   <w:shd w:val="clear" w:color="auto" w:fill="FDF0F0"/>
                   <w:tcMar>
                     <w:top w:w="48" w:type="dxa"/>
@@ -1703,13 +1920,13 @@
                       <w:color w:val="1A1A2E"/>
                       <w:sz w:val="18"/>
                     </w:rPr>
-                    <w:t>Huizache</w:t>
+                    <w:t>GD, EXG</w:t>
                   </w:r>
                 </w:p>
               </w:tc>
               <w:tc>
                 <w:tcPr>
-                  <w:tcW w:type="dxa" w:w="2561"/>
+                  <w:tcW w:type="dxa" w:w="3841"/>
                   <w:shd w:val="clear" w:color="auto" w:fill="FDF0F0"/>
                   <w:tcMar>
                     <w:top w:w="48" w:type="dxa"/>
@@ -1729,273 +1946,7 @@
                       <w:color w:val="1E3A6E"/>
                       <w:sz w:val="18"/>
                     </w:rPr>
-                    <w:t>10, 12</w:t>
-                  </w:r>
-                </w:p>
-              </w:tc>
-              <w:tc>
-                <w:tcPr>
-                  <w:tcW w:type="dxa" w:w="2561"/>
-                  <w:shd w:val="clear" w:color="auto" w:fill="FDF0F0"/>
-                  <w:tcMar>
-                    <w:top w:w="48" w:type="dxa"/>
-                    <w:bottom w:w="48" w:type="dxa"/>
-                    <w:left w:w="100" w:type="dxa"/>
-                    <w:right w:w="100" w:type="dxa"/>
-                  </w:tcMar>
-                </w:tcPr>
-                <w:p>
-                  <w:pPr>
-                    <w:spacing w:before="0" w:after="0"/>
-                    <w:jc w:val="right"/>
-                  </w:pPr>
-                  <w:r>
-                    <w:rPr>
-                      <w:b/>
-                      <w:color w:val="1E3A6E"/>
-                      <w:sz w:val="18"/>
-                    </w:rPr>
-                    <w:t>$245</w:t>
-                  </w:r>
-                </w:p>
-              </w:tc>
-            </w:tr>
-            <w:tr>
-              <w:tc>
-                <w:tcPr>
-                  <w:tcW w:type="dxa" w:w="2561"/>
-                  <w:shd w:val="clear" w:color="auto" w:fill="FFFFFF"/>
-                  <w:tcMar>
-                    <w:top w:w="48" w:type="dxa"/>
-                    <w:bottom w:w="48" w:type="dxa"/>
-                    <w:left w:w="100" w:type="dxa"/>
-                    <w:right w:w="100" w:type="dxa"/>
-                  </w:tcMar>
-                </w:tcPr>
-                <w:p>
-                  <w:pPr>
-                    <w:spacing w:before="0" w:after="0"/>
-                    <w:jc w:val="left"/>
-                  </w:pPr>
-                  <w:r>
-                    <w:rPr>
-                      <w:b w:val="0"/>
-                      <w:color w:val="1A1A2E"/>
-                      <w:sz w:val="18"/>
-                    </w:rPr>
-                    <w:t>Huizache</w:t>
-                  </w:r>
-                </w:p>
-              </w:tc>
-              <w:tc>
-                <w:tcPr>
-                  <w:tcW w:type="dxa" w:w="2561"/>
-                  <w:shd w:val="clear" w:color="auto" w:fill="FFFFFF"/>
-                  <w:tcMar>
-                    <w:top w:w="48" w:type="dxa"/>
-                    <w:bottom w:w="48" w:type="dxa"/>
-                    <w:left w:w="100" w:type="dxa"/>
-                    <w:right w:w="100" w:type="dxa"/>
-                  </w:tcMar>
-                </w:tcPr>
-                <w:p>
-                  <w:pPr>
-                    <w:spacing w:before="0" w:after="0"/>
-                    <w:jc w:val="right"/>
-                  </w:pPr>
-                  <w:r>
-                    <w:rPr>
-                      <w:b/>
-                      <w:color w:val="1E3A6E"/>
-                      <w:sz w:val="18"/>
-                    </w:rPr>
-                    <w:t>14, 16</w:t>
-                  </w:r>
-                </w:p>
-              </w:tc>
-              <w:tc>
-                <w:tcPr>
-                  <w:tcW w:type="dxa" w:w="2561"/>
-                  <w:shd w:val="clear" w:color="auto" w:fill="FFFFFF"/>
-                  <w:tcMar>
-                    <w:top w:w="48" w:type="dxa"/>
-                    <w:bottom w:w="48" w:type="dxa"/>
-                    <w:left w:w="100" w:type="dxa"/>
-                    <w:right w:w="100" w:type="dxa"/>
-                  </w:tcMar>
-                </w:tcPr>
-                <w:p>
-                  <w:pPr>
-                    <w:spacing w:before="0" w:after="0"/>
-                    <w:jc w:val="right"/>
-                  </w:pPr>
-                  <w:r>
-                    <w:rPr>
-                      <w:b/>
-                      <w:color w:val="1E3A6E"/>
-                      <w:sz w:val="18"/>
-                    </w:rPr>
-                    <w:t>$250</w:t>
-                  </w:r>
-                </w:p>
-              </w:tc>
-            </w:tr>
-            <w:tr>
-              <w:tc>
-                <w:tcPr>
-                  <w:tcW w:type="dxa" w:w="2561"/>
-                  <w:shd w:val="clear" w:color="auto" w:fill="FDF0F0"/>
-                  <w:tcMar>
-                    <w:top w:w="48" w:type="dxa"/>
-                    <w:bottom w:w="48" w:type="dxa"/>
-                    <w:left w:w="100" w:type="dxa"/>
-                    <w:right w:w="100" w:type="dxa"/>
-                  </w:tcMar>
-                </w:tcPr>
-                <w:p>
-                  <w:pPr>
-                    <w:spacing w:before="0" w:after="0"/>
-                    <w:jc w:val="left"/>
-                  </w:pPr>
-                  <w:r>
-                    <w:rPr>
-                      <w:b w:val="0"/>
-                      <w:color w:val="1A1A2E"/>
-                      <w:sz w:val="18"/>
-                    </w:rPr>
-                    <w:t>Huizache</w:t>
-                  </w:r>
-                </w:p>
-              </w:tc>
-              <w:tc>
-                <w:tcPr>
-                  <w:tcW w:type="dxa" w:w="2561"/>
-                  <w:shd w:val="clear" w:color="auto" w:fill="FDF0F0"/>
-                  <w:tcMar>
-                    <w:top w:w="48" w:type="dxa"/>
-                    <w:bottom w:w="48" w:type="dxa"/>
-                    <w:left w:w="100" w:type="dxa"/>
-                    <w:right w:w="100" w:type="dxa"/>
-                  </w:tcMar>
-                </w:tcPr>
-                <w:p>
-                  <w:pPr>
-                    <w:spacing w:before="0" w:after="0"/>
-                    <w:jc w:val="right"/>
-                  </w:pPr>
-                  <w:r>
-                    <w:rPr>
-                      <w:b/>
-                      <w:color w:val="1E3A6E"/>
-                      <w:sz w:val="18"/>
-                    </w:rPr>
-                    <w:t>34, 36</w:t>
-                  </w:r>
-                </w:p>
-              </w:tc>
-              <w:tc>
-                <w:tcPr>
-                  <w:tcW w:type="dxa" w:w="2561"/>
-                  <w:shd w:val="clear" w:color="auto" w:fill="FDF0F0"/>
-                  <w:tcMar>
-                    <w:top w:w="48" w:type="dxa"/>
-                    <w:bottom w:w="48" w:type="dxa"/>
-                    <w:left w:w="100" w:type="dxa"/>
-                    <w:right w:w="100" w:type="dxa"/>
-                  </w:tcMar>
-                </w:tcPr>
-                <w:p>
-                  <w:pPr>
-                    <w:spacing w:before="0" w:after="0"/>
-                    <w:jc w:val="right"/>
-                  </w:pPr>
-                  <w:r>
-                    <w:rPr>
-                      <w:b/>
-                      <w:color w:val="1E3A6E"/>
-                      <w:sz w:val="18"/>
-                    </w:rPr>
-                    <w:t>$270</w:t>
-                  </w:r>
-                </w:p>
-              </w:tc>
-            </w:tr>
-            <w:tr>
-              <w:tc>
-                <w:tcPr>
-                  <w:tcW w:type="dxa" w:w="2561"/>
-                  <w:shd w:val="clear" w:color="auto" w:fill="FFFFFF"/>
-                  <w:tcMar>
-                    <w:top w:w="48" w:type="dxa"/>
-                    <w:bottom w:w="48" w:type="dxa"/>
-                    <w:left w:w="100" w:type="dxa"/>
-                    <w:right w:w="100" w:type="dxa"/>
-                  </w:tcMar>
-                </w:tcPr>
-                <w:p>
-                  <w:pPr>
-                    <w:spacing w:before="0" w:after="0"/>
-                    <w:jc w:val="left"/>
-                  </w:pPr>
-                  <w:r>
-                    <w:rPr>
-                      <w:b w:val="0"/>
-                      <w:color w:val="1A1A2E"/>
-                      <w:sz w:val="18"/>
-                    </w:rPr>
-                    <w:t>Albino García Ramos</w:t>
-                  </w:r>
-                </w:p>
-              </w:tc>
-              <w:tc>
-                <w:tcPr>
-                  <w:tcW w:type="dxa" w:w="2561"/>
-                  <w:shd w:val="clear" w:color="auto" w:fill="FFFFFF"/>
-                  <w:tcMar>
-                    <w:top w:w="48" w:type="dxa"/>
-                    <w:bottom w:w="48" w:type="dxa"/>
-                    <w:left w:w="100" w:type="dxa"/>
-                    <w:right w:w="100" w:type="dxa"/>
-                  </w:tcMar>
-                </w:tcPr>
-                <w:p>
-                  <w:pPr>
-                    <w:spacing w:before="0" w:after="0"/>
-                    <w:jc w:val="right"/>
-                  </w:pPr>
-                  <w:r>
-                    <w:rPr>
-                      <w:b/>
-                      <w:color w:val="1E3A6E"/>
-                      <w:sz w:val="18"/>
-                    </w:rPr>
-                    <w:t>36–42</w:t>
-                  </w:r>
-                </w:p>
-              </w:tc>
-              <w:tc>
-                <w:tcPr>
-                  <w:tcW w:type="dxa" w:w="2561"/>
-                  <w:shd w:val="clear" w:color="auto" w:fill="FFFFFF"/>
-                  <w:tcMar>
-                    <w:top w:w="48" w:type="dxa"/>
-                    <w:bottom w:w="48" w:type="dxa"/>
-                    <w:left w:w="100" w:type="dxa"/>
-                    <w:right w:w="100" w:type="dxa"/>
-                  </w:tcMar>
-                </w:tcPr>
-                <w:p>
-                  <w:pPr>
-                    <w:spacing w:before="0" w:after="0"/>
-                    <w:jc w:val="right"/>
-                  </w:pPr>
-                  <w:r>
-                    <w:rPr>
-                      <w:b/>
-                      <w:color w:val="1E3A6E"/>
-                      <w:sz w:val="18"/>
-                    </w:rPr>
-                    <w:t>$290</w:t>
+                    <w:t>$309</w:t>
                   </w:r>
                 </w:p>
               </w:tc>
@@ -2058,7 +2009,7 @@
                       <w:color w:val="FFFFFF"/>
                       <w:sz w:val="20"/>
                     </w:rPr>
-                    <w:t>Excepciones — Primaria (2/2)</w:t>
+                    <w:t>Huizache</w:t>
                   </w:r>
                 </w:p>
               </w:tc>
@@ -2072,14 +2023,13 @@
               <w:tblLook w:firstColumn="1" w:firstRow="1" w:lastColumn="0" w:lastRow="0" w:noHBand="0" w:noVBand="1" w:val="04A0"/>
             </w:tblPr>
             <w:tblGrid>
-              <w:gridCol w:w="2561"/>
-              <w:gridCol w:w="2561"/>
-              <w:gridCol w:w="2561"/>
+              <w:gridCol w:w="3841"/>
+              <w:gridCol w:w="3841"/>
             </w:tblGrid>
             <w:tr>
               <w:tc>
                 <w:tcPr>
-                  <w:tcW w:type="dxa" w:w="2561"/>
+                  <w:tcW w:type="dxa" w:w="3841"/>
                   <w:shd w:val="clear" w:color="auto" w:fill="FCE8E8"/>
                   <w:tcMar>
                     <w:top w:w="50" w:type="dxa"/>
@@ -2099,39 +2049,13 @@
                       <w:color w:val="B52020"/>
                       <w:sz w:val="17"/>
                     </w:rPr>
-                    <w:t>Escuela</w:t>
-                  </w:r>
-                </w:p>
-              </w:tc>
-              <w:tc>
-                <w:tcPr>
-                  <w:tcW w:type="dxa" w:w="2561"/>
-                  <w:shd w:val="clear" w:color="auto" w:fill="FCE8E8"/>
-                  <w:tcMar>
-                    <w:top w:w="50" w:type="dxa"/>
-                    <w:bottom w:w="50" w:type="dxa"/>
-                    <w:left w:w="100" w:type="dxa"/>
-                    <w:right w:w="100" w:type="dxa"/>
-                  </w:tcMar>
-                </w:tcPr>
-                <w:p>
-                  <w:pPr>
-                    <w:spacing w:before="0" w:after="0"/>
-                    <w:jc w:val="right"/>
-                  </w:pPr>
-                  <w:r>
-                    <w:rPr>
-                      <w:b/>
-                      <w:color w:val="B52020"/>
-                      <w:sz w:val="17"/>
-                    </w:rPr>
                     <w:t>Tallas</w:t>
                   </w:r>
                 </w:p>
               </w:tc>
               <w:tc>
                 <w:tcPr>
-                  <w:tcW w:type="dxa" w:w="2561"/>
+                  <w:tcW w:type="dxa" w:w="3841"/>
                   <w:shd w:val="clear" w:color="auto" w:fill="FCE8E8"/>
                   <w:tcMar>
                     <w:top w:w="50" w:type="dxa"/>
@@ -2159,7 +2083,7 @@
             <w:tr>
               <w:tc>
                 <w:tcPr>
-                  <w:tcW w:type="dxa" w:w="2561"/>
+                  <w:tcW w:type="dxa" w:w="3841"/>
                   <w:shd w:val="clear" w:color="auto" w:fill="FFFFFF"/>
                   <w:tcMar>
                     <w:top w:w="48" w:type="dxa"/>
@@ -2179,13 +2103,13 @@
                       <w:color w:val="1A1A2E"/>
                       <w:sz w:val="18"/>
                     </w:rPr>
-                    <w:t>Francisco Villa</w:t>
+                    <w:t>6, 8</w:t>
                   </w:r>
                 </w:p>
               </w:tc>
               <w:tc>
                 <w:tcPr>
-                  <w:tcW w:type="dxa" w:w="2561"/>
+                  <w:tcW w:type="dxa" w:w="3841"/>
                   <w:shd w:val="clear" w:color="auto" w:fill="FFFFFF"/>
                   <w:tcMar>
                     <w:top w:w="48" w:type="dxa"/>
@@ -2205,13 +2129,95 @@
                       <w:color w:val="1E3A6E"/>
                       <w:sz w:val="18"/>
                     </w:rPr>
-                    <w:t>10, 12</w:t>
+                    <w:t>$249</w:t>
+                  </w:r>
+                </w:p>
+              </w:tc>
+            </w:tr>
+            <w:tr>
+              <w:tc>
+                <w:tcPr>
+                  <w:tcW w:type="dxa" w:w="3841"/>
+                  <w:shd w:val="clear" w:color="auto" w:fill="FDF0F0"/>
+                  <w:tcMar>
+                    <w:top w:w="48" w:type="dxa"/>
+                    <w:bottom w:w="48" w:type="dxa"/>
+                    <w:left w:w="100" w:type="dxa"/>
+                    <w:right w:w="100" w:type="dxa"/>
+                  </w:tcMar>
+                </w:tcPr>
+                <w:p>
+                  <w:pPr>
+                    <w:spacing w:before="0" w:after="0"/>
+                    <w:jc w:val="left"/>
+                  </w:pPr>
+                  <w:r>
+                    <w:rPr>
+                      <w:b w:val="0"/>
+                      <w:color w:val="1A1A2E"/>
+                      <w:sz w:val="18"/>
+                    </w:rPr>
+                    <w:t>10, 12, 14, 16</w:t>
                   </w:r>
                 </w:p>
               </w:tc>
               <w:tc>
                 <w:tcPr>
-                  <w:tcW w:type="dxa" w:w="2561"/>
+                  <w:tcW w:type="dxa" w:w="3841"/>
+                  <w:shd w:val="clear" w:color="auto" w:fill="FDF0F0"/>
+                  <w:tcMar>
+                    <w:top w:w="48" w:type="dxa"/>
+                    <w:bottom w:w="48" w:type="dxa"/>
+                    <w:left w:w="100" w:type="dxa"/>
+                    <w:right w:w="100" w:type="dxa"/>
+                  </w:tcMar>
+                </w:tcPr>
+                <w:p>
+                  <w:pPr>
+                    <w:spacing w:before="0" w:after="0"/>
+                    <w:jc w:val="right"/>
+                  </w:pPr>
+                  <w:r>
+                    <w:rPr>
+                      <w:b/>
+                      <w:color w:val="1E3A6E"/>
+                      <w:sz w:val="18"/>
+                    </w:rPr>
+                    <w:t>$269</w:t>
+                  </w:r>
+                </w:p>
+              </w:tc>
+            </w:tr>
+            <w:tr>
+              <w:tc>
+                <w:tcPr>
+                  <w:tcW w:type="dxa" w:w="3841"/>
+                  <w:shd w:val="clear" w:color="auto" w:fill="FFFFFF"/>
+                  <w:tcMar>
+                    <w:top w:w="48" w:type="dxa"/>
+                    <w:bottom w:w="48" w:type="dxa"/>
+                    <w:left w:w="100" w:type="dxa"/>
+                    <w:right w:w="100" w:type="dxa"/>
+                  </w:tcMar>
+                </w:tcPr>
+                <w:p>
+                  <w:pPr>
+                    <w:spacing w:before="0" w:after="0"/>
+                    <w:jc w:val="left"/>
+                  </w:pPr>
+                  <w:r>
+                    <w:rPr>
+                      <w:b w:val="0"/>
+                      <w:color w:val="1A1A2E"/>
+                      <w:sz w:val="18"/>
+                    </w:rPr>
+                    <w:t>34</w:t>
+                  </w:r>
+                </w:p>
+              </w:tc>
+              <w:tc>
+                <w:tcPr>
+                  <w:tcW w:type="dxa" w:w="3841"/>
                   <w:shd w:val="clear" w:color="auto" w:fill="FFFFFF"/>
                   <w:tcMar>
                     <w:top w:w="48" w:type="dxa"/>
@@ -2231,7 +2237,7 @@
                       <w:color w:val="1E3A6E"/>
                       <w:sz w:val="18"/>
                     </w:rPr>
-                    <w:t>$250</w:t>
+                    <w:t>$289</w:t>
                   </w:r>
                 </w:p>
               </w:tc>
@@ -2239,7 +2245,7 @@
             <w:tr>
               <w:tc>
                 <w:tcPr>
-                  <w:tcW w:type="dxa" w:w="2561"/>
+                  <w:tcW w:type="dxa" w:w="3841"/>
                   <w:shd w:val="clear" w:color="auto" w:fill="FDF0F0"/>
                   <w:tcMar>
                     <w:top w:w="48" w:type="dxa"/>
@@ -2259,13 +2265,13 @@
                       <w:color w:val="1A1A2E"/>
                       <w:sz w:val="18"/>
                     </w:rPr>
-                    <w:t>Francisco Villa</w:t>
+                    <w:t>36</w:t>
                   </w:r>
                 </w:p>
               </w:tc>
               <w:tc>
                 <w:tcPr>
-                  <w:tcW w:type="dxa" w:w="2561"/>
+                  <w:tcW w:type="dxa" w:w="3841"/>
                   <w:shd w:val="clear" w:color="auto" w:fill="FDF0F0"/>
                   <w:tcMar>
                     <w:top w:w="48" w:type="dxa"/>
@@ -2285,593 +2291,7 @@
                       <w:color w:val="1E3A6E"/>
                       <w:sz w:val="18"/>
                     </w:rPr>
-                    <w:t>14, 16</w:t>
-                  </w:r>
-                </w:p>
-              </w:tc>
-              <w:tc>
-                <w:tcPr>
-                  <w:tcW w:type="dxa" w:w="2561"/>
-                  <w:shd w:val="clear" w:color="auto" w:fill="FDF0F0"/>
-                  <w:tcMar>
-                    <w:top w:w="48" w:type="dxa"/>
-                    <w:bottom w:w="48" w:type="dxa"/>
-                    <w:left w:w="100" w:type="dxa"/>
-                    <w:right w:w="100" w:type="dxa"/>
-                  </w:tcMar>
-                </w:tcPr>
-                <w:p>
-                  <w:pPr>
-                    <w:spacing w:before="0" w:after="0"/>
-                    <w:jc w:val="right"/>
-                  </w:pPr>
-                  <w:r>
-                    <w:rPr>
-                      <w:b/>
-                      <w:color w:val="1E3A6E"/>
-                      <w:sz w:val="18"/>
-                    </w:rPr>
-                    <w:t>$260</w:t>
-                  </w:r>
-                </w:p>
-              </w:tc>
-            </w:tr>
-            <w:tr>
-              <w:tc>
-                <w:tcPr>
-                  <w:tcW w:type="dxa" w:w="2561"/>
-                  <w:shd w:val="clear" w:color="auto" w:fill="FFFFFF"/>
-                  <w:tcMar>
-                    <w:top w:w="48" w:type="dxa"/>
-                    <w:bottom w:w="48" w:type="dxa"/>
-                    <w:left w:w="100" w:type="dxa"/>
-                    <w:right w:w="100" w:type="dxa"/>
-                  </w:tcMar>
-                </w:tcPr>
-                <w:p>
-                  <w:pPr>
-                    <w:spacing w:before="0" w:after="0"/>
-                    <w:jc w:val="left"/>
-                  </w:pPr>
-                  <w:r>
-                    <w:rPr>
-                      <w:b w:val="0"/>
-                      <w:color w:val="1A1A2E"/>
-                      <w:sz w:val="18"/>
-                    </w:rPr>
-                    <w:t>Francisco Villa</w:t>
-                  </w:r>
-                </w:p>
-              </w:tc>
-              <w:tc>
-                <w:tcPr>
-                  <w:tcW w:type="dxa" w:w="2561"/>
-                  <w:shd w:val="clear" w:color="auto" w:fill="FFFFFF"/>
-                  <w:tcMar>
-                    <w:top w:w="48" w:type="dxa"/>
-                    <w:bottom w:w="48" w:type="dxa"/>
-                    <w:left w:w="100" w:type="dxa"/>
-                    <w:right w:w="100" w:type="dxa"/>
-                  </w:tcMar>
-                </w:tcPr>
-                <w:p>
-                  <w:pPr>
-                    <w:spacing w:before="0" w:after="0"/>
-                    <w:jc w:val="right"/>
-                  </w:pPr>
-                  <w:r>
-                    <w:rPr>
-                      <w:b/>
-                      <w:color w:val="1E3A6E"/>
-                      <w:sz w:val="18"/>
-                    </w:rPr>
-                    <w:t>34, 36</w:t>
-                  </w:r>
-                </w:p>
-              </w:tc>
-              <w:tc>
-                <w:tcPr>
-                  <w:tcW w:type="dxa" w:w="2561"/>
-                  <w:shd w:val="clear" w:color="auto" w:fill="FFFFFF"/>
-                  <w:tcMar>
-                    <w:top w:w="48" w:type="dxa"/>
-                    <w:bottom w:w="48" w:type="dxa"/>
-                    <w:left w:w="100" w:type="dxa"/>
-                    <w:right w:w="100" w:type="dxa"/>
-                  </w:tcMar>
-                </w:tcPr>
-                <w:p>
-                  <w:pPr>
-                    <w:spacing w:before="0" w:after="0"/>
-                    <w:jc w:val="right"/>
-                  </w:pPr>
-                  <w:r>
-                    <w:rPr>
-                      <w:b/>
-                      <w:color w:val="1E3A6E"/>
-                      <w:sz w:val="18"/>
-                    </w:rPr>
-                    <w:t>$290</w:t>
-                  </w:r>
-                </w:p>
-              </w:tc>
-            </w:tr>
-            <w:tr>
-              <w:tc>
-                <w:tcPr>
-                  <w:tcW w:type="dxa" w:w="2561"/>
-                  <w:shd w:val="clear" w:color="auto" w:fill="FDF0F0"/>
-                  <w:tcMar>
-                    <w:top w:w="48" w:type="dxa"/>
-                    <w:bottom w:w="48" w:type="dxa"/>
-                    <w:left w:w="100" w:type="dxa"/>
-                    <w:right w:w="100" w:type="dxa"/>
-                  </w:tcMar>
-                </w:tcPr>
-                <w:p>
-                  <w:pPr>
-                    <w:spacing w:before="0" w:after="0"/>
-                    <w:jc w:val="left"/>
-                  </w:pPr>
-                  <w:r>
-                    <w:rPr>
-                      <w:b w:val="0"/>
-                      <w:color w:val="1A1A2E"/>
-                      <w:sz w:val="18"/>
-                    </w:rPr>
-                    <w:t>Francisco Villa</w:t>
-                  </w:r>
-                </w:p>
-              </w:tc>
-              <w:tc>
-                <w:tcPr>
-                  <w:tcW w:type="dxa" w:w="2561"/>
-                  <w:shd w:val="clear" w:color="auto" w:fill="FDF0F0"/>
-                  <w:tcMar>
-                    <w:top w:w="48" w:type="dxa"/>
-                    <w:bottom w:w="48" w:type="dxa"/>
-                    <w:left w:w="100" w:type="dxa"/>
-                    <w:right w:w="100" w:type="dxa"/>
-                  </w:tcMar>
-                </w:tcPr>
-                <w:p>
-                  <w:pPr>
-                    <w:spacing w:before="0" w:after="0"/>
-                    <w:jc w:val="right"/>
-                  </w:pPr>
-                  <w:r>
-                    <w:rPr>
-                      <w:b/>
-                      <w:color w:val="1E3A6E"/>
-                      <w:sz w:val="18"/>
-                    </w:rPr>
-                    <w:t>38, 40</w:t>
-                  </w:r>
-                </w:p>
-              </w:tc>
-              <w:tc>
-                <w:tcPr>
-                  <w:tcW w:type="dxa" w:w="2561"/>
-                  <w:shd w:val="clear" w:color="auto" w:fill="FDF0F0"/>
-                  <w:tcMar>
-                    <w:top w:w="48" w:type="dxa"/>
-                    <w:bottom w:w="48" w:type="dxa"/>
-                    <w:left w:w="100" w:type="dxa"/>
-                    <w:right w:w="100" w:type="dxa"/>
-                  </w:tcMar>
-                </w:tcPr>
-                <w:p>
-                  <w:pPr>
-                    <w:spacing w:before="0" w:after="0"/>
-                    <w:jc w:val="right"/>
-                  </w:pPr>
-                  <w:r>
-                    <w:rPr>
-                      <w:b/>
-                      <w:color w:val="1E3A6E"/>
-                      <w:sz w:val="18"/>
-                    </w:rPr>
-                    <w:t>$300</w:t>
-                  </w:r>
-                </w:p>
-              </w:tc>
-            </w:tr>
-            <w:tr>
-              <w:tc>
-                <w:tcPr>
-                  <w:tcW w:type="dxa" w:w="2561"/>
-                  <w:shd w:val="clear" w:color="auto" w:fill="FFFFFF"/>
-                  <w:tcMar>
-                    <w:top w:w="48" w:type="dxa"/>
-                    <w:bottom w:w="48" w:type="dxa"/>
-                    <w:left w:w="100" w:type="dxa"/>
-                    <w:right w:w="100" w:type="dxa"/>
-                  </w:tcMar>
-                </w:tcPr>
-                <w:p>
-                  <w:pPr>
-                    <w:spacing w:before="0" w:after="0"/>
-                    <w:jc w:val="left"/>
-                  </w:pPr>
-                  <w:r>
-                    <w:rPr>
-                      <w:b w:val="0"/>
-                      <w:color w:val="1A1A2E"/>
-                      <w:sz w:val="18"/>
-                    </w:rPr>
-                    <w:t>Justo Sierra</w:t>
-                  </w:r>
-                </w:p>
-              </w:tc>
-              <w:tc>
-                <w:tcPr>
-                  <w:tcW w:type="dxa" w:w="2561"/>
-                  <w:shd w:val="clear" w:color="auto" w:fill="FFFFFF"/>
-                  <w:tcMar>
-                    <w:top w:w="48" w:type="dxa"/>
-                    <w:bottom w:w="48" w:type="dxa"/>
-                    <w:left w:w="100" w:type="dxa"/>
-                    <w:right w:w="100" w:type="dxa"/>
-                  </w:tcMar>
-                </w:tcPr>
-                <w:p>
-                  <w:pPr>
-                    <w:spacing w:before="0" w:after="0"/>
-                    <w:jc w:val="right"/>
-                  </w:pPr>
-                  <w:r>
-                    <w:rPr>
-                      <w:b/>
-                      <w:color w:val="1E3A6E"/>
-                      <w:sz w:val="18"/>
-                    </w:rPr>
-                    <w:t>36</w:t>
-                  </w:r>
-                </w:p>
-              </w:tc>
-              <w:tc>
-                <w:tcPr>
-                  <w:tcW w:type="dxa" w:w="2561"/>
-                  <w:shd w:val="clear" w:color="auto" w:fill="FFFFFF"/>
-                  <w:tcMar>
-                    <w:top w:w="48" w:type="dxa"/>
-                    <w:bottom w:w="48" w:type="dxa"/>
-                    <w:left w:w="100" w:type="dxa"/>
-                    <w:right w:w="100" w:type="dxa"/>
-                  </w:tcMar>
-                </w:tcPr>
-                <w:p>
-                  <w:pPr>
-                    <w:spacing w:before="0" w:after="0"/>
-                    <w:jc w:val="right"/>
-                  </w:pPr>
-                  <w:r>
-                    <w:rPr>
-                      <w:b/>
-                      <w:color w:val="1E3A6E"/>
-                      <w:sz w:val="18"/>
-                    </w:rPr>
-                    <w:t>$275</w:t>
-                  </w:r>
-                </w:p>
-              </w:tc>
-            </w:tr>
-            <w:tr>
-              <w:tc>
-                <w:tcPr>
-                  <w:tcW w:type="dxa" w:w="2561"/>
-                  <w:shd w:val="clear" w:color="auto" w:fill="FDF0F0"/>
-                  <w:tcMar>
-                    <w:top w:w="48" w:type="dxa"/>
-                    <w:bottom w:w="48" w:type="dxa"/>
-                    <w:left w:w="100" w:type="dxa"/>
-                    <w:right w:w="100" w:type="dxa"/>
-                  </w:tcMar>
-                </w:tcPr>
-                <w:p>
-                  <w:pPr>
-                    <w:spacing w:before="0" w:after="0"/>
-                    <w:jc w:val="left"/>
-                  </w:pPr>
-                  <w:r>
-                    <w:rPr>
-                      <w:b w:val="0"/>
-                      <w:color w:val="1A1A2E"/>
-                      <w:sz w:val="18"/>
-                    </w:rPr>
-                    <w:t>Justo Sierra</w:t>
-                  </w:r>
-                </w:p>
-              </w:tc>
-              <w:tc>
-                <w:tcPr>
-                  <w:tcW w:type="dxa" w:w="2561"/>
-                  <w:shd w:val="clear" w:color="auto" w:fill="FDF0F0"/>
-                  <w:tcMar>
-                    <w:top w:w="48" w:type="dxa"/>
-                    <w:bottom w:w="48" w:type="dxa"/>
-                    <w:left w:w="100" w:type="dxa"/>
-                    <w:right w:w="100" w:type="dxa"/>
-                  </w:tcMar>
-                </w:tcPr>
-                <w:p>
-                  <w:pPr>
-                    <w:spacing w:before="0" w:after="0"/>
-                    <w:jc w:val="right"/>
-                  </w:pPr>
-                  <w:r>
-                    <w:rPr>
-                      <w:b/>
-                      <w:color w:val="1E3A6E"/>
-                      <w:sz w:val="18"/>
-                    </w:rPr>
-                    <w:t>38</w:t>
-                  </w:r>
-                </w:p>
-              </w:tc>
-              <w:tc>
-                <w:tcPr>
-                  <w:tcW w:type="dxa" w:w="2561"/>
-                  <w:shd w:val="clear" w:color="auto" w:fill="FDF0F0"/>
-                  <w:tcMar>
-                    <w:top w:w="48" w:type="dxa"/>
-                    <w:bottom w:w="48" w:type="dxa"/>
-                    <w:left w:w="100" w:type="dxa"/>
-                    <w:right w:w="100" w:type="dxa"/>
-                  </w:tcMar>
-                </w:tcPr>
-                <w:p>
-                  <w:pPr>
-                    <w:spacing w:before="0" w:after="0"/>
-                    <w:jc w:val="right"/>
-                  </w:pPr>
-                  <w:r>
-                    <w:rPr>
-                      <w:b/>
-                      <w:color w:val="1E3A6E"/>
-                      <w:sz w:val="18"/>
-                    </w:rPr>
-                    <w:t>$280</w:t>
-                  </w:r>
-                </w:p>
-              </w:tc>
-            </w:tr>
-            <w:tr>
-              <w:tc>
-                <w:tcPr>
-                  <w:tcW w:type="dxa" w:w="2561"/>
-                  <w:shd w:val="clear" w:color="auto" w:fill="FFFFFF"/>
-                  <w:tcMar>
-                    <w:top w:w="48" w:type="dxa"/>
-                    <w:bottom w:w="48" w:type="dxa"/>
-                    <w:left w:w="100" w:type="dxa"/>
-                    <w:right w:w="100" w:type="dxa"/>
-                  </w:tcMar>
-                </w:tcPr>
-                <w:p>
-                  <w:pPr>
-                    <w:spacing w:before="0" w:after="0"/>
-                    <w:jc w:val="left"/>
-                  </w:pPr>
-                  <w:r>
-                    <w:rPr>
-                      <w:b w:val="0"/>
-                      <w:color w:val="1A1A2E"/>
-                      <w:sz w:val="18"/>
-                    </w:rPr>
-                    <w:t>Miguel Campuzano</w:t>
-                  </w:r>
-                </w:p>
-              </w:tc>
-              <w:tc>
-                <w:tcPr>
-                  <w:tcW w:type="dxa" w:w="2561"/>
-                  <w:shd w:val="clear" w:color="auto" w:fill="FFFFFF"/>
-                  <w:tcMar>
-                    <w:top w:w="48" w:type="dxa"/>
-                    <w:bottom w:w="48" w:type="dxa"/>
-                    <w:left w:w="100" w:type="dxa"/>
-                    <w:right w:w="100" w:type="dxa"/>
-                  </w:tcMar>
-                </w:tcPr>
-                <w:p>
-                  <w:pPr>
-                    <w:spacing w:before="0" w:after="0"/>
-                    <w:jc w:val="right"/>
-                  </w:pPr>
-                  <w:r>
-                    <w:rPr>
-                      <w:b/>
-                      <w:color w:val="1E3A6E"/>
-                      <w:sz w:val="18"/>
-                    </w:rPr>
-                    <w:t>34</w:t>
-                  </w:r>
-                </w:p>
-              </w:tc>
-              <w:tc>
-                <w:tcPr>
-                  <w:tcW w:type="dxa" w:w="2561"/>
-                  <w:shd w:val="clear" w:color="auto" w:fill="FFFFFF"/>
-                  <w:tcMar>
-                    <w:top w:w="48" w:type="dxa"/>
-                    <w:bottom w:w="48" w:type="dxa"/>
-                    <w:left w:w="100" w:type="dxa"/>
-                    <w:right w:w="100" w:type="dxa"/>
-                  </w:tcMar>
-                </w:tcPr>
-                <w:p>
-                  <w:pPr>
-                    <w:spacing w:before="0" w:after="0"/>
-                    <w:jc w:val="right"/>
-                  </w:pPr>
-                  <w:r>
-                    <w:rPr>
-                      <w:b/>
-                      <w:color w:val="1E3A6E"/>
-                      <w:sz w:val="18"/>
-                    </w:rPr>
-                    <w:t>$280</w:t>
-                  </w:r>
-                </w:p>
-              </w:tc>
-            </w:tr>
-            <w:tr>
-              <w:tc>
-                <w:tcPr>
-                  <w:tcW w:type="dxa" w:w="2561"/>
-                  <w:shd w:val="clear" w:color="auto" w:fill="FDF0F0"/>
-                  <w:tcMar>
-                    <w:top w:w="48" w:type="dxa"/>
-                    <w:bottom w:w="48" w:type="dxa"/>
-                    <w:left w:w="100" w:type="dxa"/>
-                    <w:right w:w="100" w:type="dxa"/>
-                  </w:tcMar>
-                </w:tcPr>
-                <w:p>
-                  <w:pPr>
-                    <w:spacing w:before="0" w:after="0"/>
-                    <w:jc w:val="left"/>
-                  </w:pPr>
-                  <w:r>
-                    <w:rPr>
-                      <w:b w:val="0"/>
-                      <w:color w:val="1A1A2E"/>
-                      <w:sz w:val="18"/>
-                    </w:rPr>
-                    <w:t>Miguel Hidalgo</w:t>
-                  </w:r>
-                </w:p>
-              </w:tc>
-              <w:tc>
-                <w:tcPr>
-                  <w:tcW w:type="dxa" w:w="2561"/>
-                  <w:shd w:val="clear" w:color="auto" w:fill="FDF0F0"/>
-                  <w:tcMar>
-                    <w:top w:w="48" w:type="dxa"/>
-                    <w:bottom w:w="48" w:type="dxa"/>
-                    <w:left w:w="100" w:type="dxa"/>
-                    <w:right w:w="100" w:type="dxa"/>
-                  </w:tcMar>
-                </w:tcPr>
-                <w:p>
-                  <w:pPr>
-                    <w:spacing w:before="0" w:after="0"/>
-                    <w:jc w:val="right"/>
-                  </w:pPr>
-                  <w:r>
-                    <w:rPr>
-                      <w:b/>
-                      <w:color w:val="1E3A6E"/>
-                      <w:sz w:val="18"/>
-                    </w:rPr>
-                    <w:t>36, 38</w:t>
-                  </w:r>
-                </w:p>
-              </w:tc>
-              <w:tc>
-                <w:tcPr>
-                  <w:tcW w:type="dxa" w:w="2561"/>
-                  <w:shd w:val="clear" w:color="auto" w:fill="FDF0F0"/>
-                  <w:tcMar>
-                    <w:top w:w="48" w:type="dxa"/>
-                    <w:bottom w:w="48" w:type="dxa"/>
-                    <w:left w:w="100" w:type="dxa"/>
-                    <w:right w:w="100" w:type="dxa"/>
-                  </w:tcMar>
-                </w:tcPr>
-                <w:p>
-                  <w:pPr>
-                    <w:spacing w:before="0" w:after="0"/>
-                    <w:jc w:val="right"/>
-                  </w:pPr>
-                  <w:r>
-                    <w:rPr>
-                      <w:b/>
-                      <w:color w:val="1E3A6E"/>
-                      <w:sz w:val="18"/>
-                    </w:rPr>
-                    <w:t>$275</w:t>
-                  </w:r>
-                </w:p>
-              </w:tc>
-            </w:tr>
-            <w:tr>
-              <w:tc>
-                <w:tcPr>
-                  <w:tcW w:type="dxa" w:w="2561"/>
-                  <w:shd w:val="clear" w:color="auto" w:fill="FFFFFF"/>
-                  <w:tcMar>
-                    <w:top w:w="48" w:type="dxa"/>
-                    <w:bottom w:w="48" w:type="dxa"/>
-                    <w:left w:w="100" w:type="dxa"/>
-                    <w:right w:w="100" w:type="dxa"/>
-                  </w:tcMar>
-                </w:tcPr>
-                <w:p>
-                  <w:pPr>
-                    <w:spacing w:before="0" w:after="0"/>
-                    <w:jc w:val="left"/>
-                  </w:pPr>
-                  <w:r>
-                    <w:rPr>
-                      <w:b w:val="0"/>
-                      <w:color w:val="1A1A2E"/>
-                      <w:sz w:val="18"/>
-                    </w:rPr>
-                    <w:t>Miguel Hidalgo</w:t>
-                  </w:r>
-                </w:p>
-              </w:tc>
-              <w:tc>
-                <w:tcPr>
-                  <w:tcW w:type="dxa" w:w="2561"/>
-                  <w:shd w:val="clear" w:color="auto" w:fill="FFFFFF"/>
-                  <w:tcMar>
-                    <w:top w:w="48" w:type="dxa"/>
-                    <w:bottom w:w="48" w:type="dxa"/>
-                    <w:left w:w="100" w:type="dxa"/>
-                    <w:right w:w="100" w:type="dxa"/>
-                  </w:tcMar>
-                </w:tcPr>
-                <w:p>
-                  <w:pPr>
-                    <w:spacing w:before="0" w:after="0"/>
-                    <w:jc w:val="right"/>
-                  </w:pPr>
-                  <w:r>
-                    <w:rPr>
-                      <w:b/>
-                      <w:color w:val="1E3A6E"/>
-                      <w:sz w:val="18"/>
-                    </w:rPr>
-                    <w:t>40, 42</w:t>
-                  </w:r>
-                </w:p>
-              </w:tc>
-              <w:tc>
-                <w:tcPr>
-                  <w:tcW w:type="dxa" w:w="2561"/>
-                  <w:shd w:val="clear" w:color="auto" w:fill="FFFFFF"/>
-                  <w:tcMar>
-                    <w:top w:w="48" w:type="dxa"/>
-                    <w:bottom w:w="48" w:type="dxa"/>
-                    <w:left w:w="100" w:type="dxa"/>
-                    <w:right w:w="100" w:type="dxa"/>
-                  </w:tcMar>
-                </w:tcPr>
-                <w:p>
-                  <w:pPr>
-                    <w:spacing w:before="0" w:after="0"/>
-                    <w:jc w:val="right"/>
-                  </w:pPr>
-                  <w:r>
-                    <w:rPr>
-                      <w:b/>
-                      <w:color w:val="1E3A6E"/>
-                      <w:sz w:val="18"/>
-                    </w:rPr>
-                    <w:t>$285</w:t>
+                    <w:t>$299</w:t>
                   </w:r>
                 </w:p>
               </w:tc>
@@ -2901,7 +2321,7 @@
           <w:color w:val="666666"/>
           <w:sz w:val="17"/>
         </w:rPr>
-        <w:t xml:space="preserve">  Huizache se normaliza con la escalera de Chaleco Oficial Primaria.</w:t>
+        <w:t xml:space="preserve">  Primaria estándar: Albino García Ramos, Francisco Villa, Himno Nacional, Ignacio Allende, Ignacio Zaragoza, Justo Sierra, Miguel Campuzano, Miguel Hidalgo.</w:t>
       </w:r>
     </w:p>
     <w:sectPr>

</xml_diff>